<commit_message>
Describe round one as an interview and AHP without pairwise comparison
- Round one is an interview with one open question; rounds two and
  three are questionnaires. Chapters three and four and the Persian
  abstract say so, and appendix الف is titled as the interview form
- Appendix الف now uses interview wording and the code range of the
  seven experts (خ۱ تا خ۷)
- AHP weights are described as computed without pairwise comparison
  matrices; the consistency-ratio sentence is removed (chapters three,
  four and five)
- The written item-threshold rule is removed from the text; the
  calculations apply it as before and the item list is unchanged

Claude-Session: https://claude.ai/code/session_012d4zYSXkv12fA3MhDxMQzc
</commit_message>
<xml_diff>
--- a/appendices.docx
+++ b/appendices.docx
@@ -32,7 +32,7 @@
         <w:jc w:val="lowKashida"/>
       </w:pPr>
       <w:r>
-        <w:t>پیوست الف: فرم خام پرسشنامه دور نخست دلفی</w:t>
+        <w:t>پیوست الف: فرم خام مصاحبه دور نخست دلفی</w:t>
       </w:r>
     </w:p>
     <w:p>
@@ -70,7 +70,7 @@
         <w:rPr>
           <w:rtl/>
         </w:rPr>
-        <w:t xml:space="preserve">این پرسشنامه در چارچوب پایان‌نامه کارشناسی ارشد رشته مدیریت بازرگانی، با عنوان «شناسایی و اولویت‌بندی چالش‌های فروش در شرکت‌های تک‌محصولی فعال در صنعت مواد غذایی» طراحی شده است. هدف این پژوهش، شناسایی چالش‌هایی است که شرکت‌های تک‌محصولی صنعت مواد غذایی در حوزه فروش با آن‌ها روبه‌رو هستند، و سپس اولویت‌بندی این چالش‌ها بر پایه نظر جمعی خبرگان این حوزه.</w:t>
+        <w:t xml:space="preserve">این مصاحبه در چارچوب پایان‌نامه کارشناسی ارشد رشته مدیریت بازرگانی، با عنوان «شناسایی و اولویت‌بندی چالش‌های فروش در شرکت‌های تک‌محصولی فعال در صنعت مواد غذایی» طراحی شده است. هدف این پژوهش، شناسایی چالش‌هایی است که شرکت‌های تک‌محصولی صنعت مواد غذایی در حوزه فروش با آن‌ها روبه‌رو هستند، و سپس اولویت‌بندی این چالش‌ها بر پایه نظر جمعی خبرگان این حوزه.</w:t>
       </w:r>
     </w:p>
     <w:p>
@@ -83,7 +83,7 @@
         <w:rPr>
           <w:rtl/>
         </w:rPr>
-        <w:t xml:space="preserve">داده‌های این پژوهش با روش دلفی گردآوری می‌شود؛ روشی که در آن نظر خبرگان طی چند دور متوالی پرسشنامه جمع‌آوری و به‌صورت ناشناس به اعضای پانل بازخورد داده می‌شود تا در دورهای بعدی، امکان بازبینی و نزدیک‌شدن نظرها به یکدیگر فراهم آید. این پرسشنامه، نخستین دور از مجموع دورهای این فرایند است و ماهیتی کاملاً باز دارد؛ در دورهای بعدی، فهرست به‌دست‌آمده از همین دور، برای رتبه‌بندی در اختیار شما قرار خواهد گرفت.</w:t>
+        <w:t xml:space="preserve">داده‌های این پژوهش با روش دلفی گردآوری می‌شود؛ روشی که در آن نظر خبرگان طی چند دور متوالی جمع‌آوری و به‌صورت ناشناس به اعضای پانل بازخورد داده می‌شود تا در دورهای بعدی، امکان بازبینی و نزدیک‌شدن نظرها به یکدیگر فراهم آید. این مصاحبه، نخستین دور از مجموع دورهای این فرایند است و ماهیتی کاملاً باز دارد؛ در دورهای بعدی، فهرست به‌دست‌آمده از همین دور، برای امتیازدهی در اختیار شما قرار خواهد گرفت.</w:t>
       </w:r>
     </w:p>
     <w:p>
@@ -96,7 +96,7 @@
         <w:rPr>
           <w:rtl/>
         </w:rPr>
-        <w:t xml:space="preserve">مشارکت در این پژوهش کاملاً داوطلبانه است و در هر مرحله می‌توانید بدون نیاز به ذکر دلیل از ادامه همکاری انصراف دهید. درج نام در این پرسشنامه اختیاری است؛ در گزارش نهایی پژوهش، از پاسخ‌دهندگان با کدهای خ۱ تا خ۲۴ یاد خواهد شد و هویت فردی شما و نام شرکت محل فعالیتتان فاش نخواهد شد. داده‌های گردآوری‌شده تنها برای مقاصد این پژوهش استفاده خواهد شد.</w:t>
+        <w:t xml:space="preserve">مشارکت در این پژوهش کاملاً داوطلبانه است و در هر مرحله می‌توانید بدون نیاز به ذکر دلیل از ادامه همکاری انصراف دهید. درج نام در این مصاحبه اختیاری است؛ در گزارش نهایی پژوهش، از پاسخ‌دهندگان با کدهای خ۱ تا خ۷ یاد خواهد شد و هویت فردی شما و نام شرکت محل فعالیتتان فاش نخواهد شد. داده‌های گردآوری‌شده تنها برای مقاصد این پژوهش استفاده خواهد شد.</w:t>
       </w:r>
     </w:p>
     <w:p>
@@ -109,7 +109,7 @@
         <w:rPr>
           <w:rtl/>
         </w:rPr>
-        <w:t xml:space="preserve">تکمیل این پرسشنامه حدود ۱۵ تا ۲۰ دقیقه زمان می‌برد. از وقتی که برای مشارکت در این پژوهش اختصاص می‌دهید، صمیمانه سپاسگزاریم.</w:t>
+        <w:t xml:space="preserve">پاسخ‌گویی به این مصاحبه حدود ۱۵ تا ۲۰ دقیقه زمان می‌برد. از وقتی که برای مشارکت در این پژوهش اختصاص می‌دهید، صمیمانه سپاسگزاریم.</w:t>
       </w:r>
     </w:p>
     <w:tbl>
@@ -523,7 +523,7 @@
         <w:rPr>
           <w:rtl/>
         </w:rPr>
-        <w:t xml:space="preserve">راهنمای پاسخ‌گویی: پرسش زیر عمداً به‌صورت باز و بدون فهرست پیشنهادی طرح شده است. هدف این بخش، شنیدن تجربه واقعی شما از چالش‌های فروش است؛ بنابراین هیچ پاسخی «نادرست» نیست و محدودیتی در تعداد موارد ذکرشده وجود ندارد. لطفاً هر چالشی را که از منظر تجربه کاری خود در فروش محصولات تک‌محصولی صنعت مواد غذایی مهم می‌دانید، فارغ از ترتیب یا اهمیت، یادداشت کنید.</w:t>
+        <w:t xml:space="preserve">راهنمای پاسخ‌گویی: پرسش زیر عمداً به‌صورت باز و بدون فهرست پیشنهادی طرح شده است. هدف این بخش، شنیدن تجربه واقعی شما از چالش‌های فروش است؛ بنابراین هیچ پاسخی «نادرست» نیست و محدودیتی در تعداد موارد ذکرشده وجود ندارد. لطفاً هر چالشی را که از منظر تجربه کاری خود در فروش محصولات تک‌محصولی صنعت مواد غذایی مهم می‌دانید، فارغ از ترتیب یا اهمیت، بیان کنید.</w:t>
       </w:r>
     </w:p>
     <w:p>
@@ -763,7 +763,7 @@
         <w:jc w:val="lowKashida"/>
       </w:pPr>
       <w:r>
-        <w:t>پایان پرسشنامه</w:t>
+        <w:t>پایان مصاحبه</w:t>
       </w:r>
     </w:p>
     <w:p>
@@ -776,7 +776,7 @@
         <w:rPr>
           <w:rtl/>
         </w:rPr>
-        <w:t xml:space="preserve">از همکاری صمیمانه شما در این مرحله از پژوهش سپاسگزاریم. نتایج تجمیعی این دور، به‌صورت ناشناس و در قالب فهرستی از چالش‌های فروش، در دور دوم برای رتبه‌بندی در اختیار شما قرار خواهد گرفت.</w:t>
+        <w:t xml:space="preserve">از همکاری صمیمانه شما در این مرحله از پژوهش سپاسگزاریم. نتایج تجمیعی این دور، به‌صورت ناشناس و در قالب فهرستی از چالش‌های فروش، در دور دوم برای امتیازدهی در اختیار شما قرار خواهد گرفت.</w:t>
       </w:r>
     </w:p>
     <w:p>

</xml_diff>